<commit_message>
agg sprint 2 doc
</commit_message>
<xml_diff>
--- a/1_QdC/QdC_CasaNote.docx
+++ b/1_QdC/QdC_CasaNote.docx
@@ -3380,26 +3380,11 @@
         <w:spacing w:before="56"/>
       </w:pPr>
       <w:r>
-        <w:t>Esportare il blocco note come testo (</w:t>
-      </w:r>
-      <w:proofErr w:type="spellStart"/>
-      <w:r>
-        <w:t>txt</w:t>
-      </w:r>
-      <w:proofErr w:type="spellEnd"/>
-      <w:r>
-        <w:t xml:space="preserve">), pdf o immagine (es: </w:t>
-      </w:r>
-      <w:proofErr w:type="spellStart"/>
-      <w:r>
-        <w:t>png</w:t>
-      </w:r>
-      <w:proofErr w:type="spellEnd"/>
-      <w:r>
-        <w:t>)</w:t>
-      </w:r>
-      <w:bookmarkStart w:id="0" w:name="_GoBack"/>
-      <w:bookmarkEnd w:id="0"/>
+        <w:t xml:space="preserve">Esportare il blocco note come </w:t>
+      </w:r>
+      <w:r>
+        <w:t>cartella zip</w:t>
+      </w:r>
     </w:p>
     <w:p>
       <w:pPr>
@@ -3434,6 +3419,8 @@
       <w:r>
         <w:t xml:space="preserve"> tutti cifrati</w:t>
       </w:r>
+      <w:bookmarkStart w:id="0" w:name="_GoBack"/>
+      <w:bookmarkEnd w:id="0"/>
     </w:p>
     <w:p>
       <w:pPr>

</xml_diff>